<commit_message>
Sin and Codex: Focus career portfolio on skills and industry expertise
Replace the dated industry timeline with accessible expertise panels and remove career and education dates from public copy, metadata and resume downloads. Preserve factual accomplishments and unrelated local resume edits.
</commit_message>
<xml_diff>
--- a/Resume/Louiery Sincioco - Architect.docx
+++ b/Resume/Louiery Sincioco - Architect.docx
@@ -151,10 +151,6 @@
         </w:rPr>
         <w:t>Data Defenders</w:t>
       </w:r>
-      <w:r>
-        <w:tab/>
-        <w:t>Jun 2022 - Mar 2026</w:t>
-      </w:r>
     </w:p>
     <w:p>
       <w:pPr>
@@ -198,10 +194,6 @@
         </w:rPr>
         <w:t>Web Partner Group</w:t>
       </w:r>
-      <w:r>
-        <w:tab/>
-        <w:t>Oct 2019 - Jun 2022</w:t>
-      </w:r>
     </w:p>
     <w:p>
       <w:pPr>
@@ -228,10 +220,6 @@
           <w:b/>
         </w:rPr>
         <w:t>Stealth Monitoring</w:t>
-      </w:r>
-      <w:r>
-        <w:tab/>
-        <w:t>Apr 2019 - Sep 2019</w:t>
       </w:r>
     </w:p>
     <w:p>
@@ -278,10 +266,6 @@
         </w:rPr>
         <w:t>Alpha Theory</w:t>
       </w:r>
-      <w:r>
-        <w:tab/>
-        <w:t>May 2016 - Feb 2018</w:t>
-      </w:r>
     </w:p>
     <w:p>
       <w:pPr>
@@ -308,10 +292,6 @@
           <w:b/>
         </w:rPr>
         <w:t>Charles Schwab</w:t>
-      </w:r>
-      <w:r>
-        <w:tab/>
-        <w:t>Oct 2014 - May 2016</w:t>
       </w:r>
     </w:p>
     <w:p>
@@ -343,7 +323,7 @@
         <w:pStyle w:val="Tech"/>
       </w:pPr>
       <w:r>
-        <w:t>Joined through Randstad as Senior iOS Developer, Oct 2014 - Feb 2015; direct role, Feb 2015 - May 2016.</w:t>
+        <w:t>Joined through Randstad as Senior iOS Developer; direct role.</w:t>
       </w:r>
     </w:p>
     <w:p>

</xml_diff>

<commit_message>
Sin and Codex: Restore recent resume chronology and summarize earlier roles
Restore verified employment dates for selected recent roles, including the complete boundary-crossing Insight Global engagement. Summarize earlier work without dates and preserve age-neutral industry panels and unrelated local resume edits.
</commit_message>
<xml_diff>
--- a/Resume/Louiery Sincioco - Architect.docx
+++ b/Resume/Louiery Sincioco - Architect.docx
@@ -151,6 +151,10 @@
         </w:rPr>
         <w:t>Data Defenders</w:t>
       </w:r>
+      <w:r>
+        <w:tab/>
+        <w:t>Jun 2022 - Mar 2026</w:t>
+      </w:r>
     </w:p>
     <w:p>
       <w:pPr>
@@ -194,6 +198,10 @@
         </w:rPr>
         <w:t>Web Partner Group</w:t>
       </w:r>
+      <w:r>
+        <w:tab/>
+        <w:t>Oct 2019 - Jun 2022</w:t>
+      </w:r>
     </w:p>
     <w:p>
       <w:pPr>
@@ -220,6 +228,10 @@
           <w:b/>
         </w:rPr>
         <w:t>Stealth Monitoring</w:t>
+      </w:r>
+      <w:r>
+        <w:tab/>
+        <w:t>Apr 2019 - Sep 2019</w:t>
       </w:r>
     </w:p>
     <w:p>
@@ -266,6 +278,10 @@
         </w:rPr>
         <w:t>Alpha Theory</w:t>
       </w:r>
+      <w:r>
+        <w:tab/>
+        <w:t>May 2016 - Feb 2018</w:t>
+      </w:r>
     </w:p>
     <w:p>
       <w:pPr>
@@ -292,6 +308,10 @@
           <w:b/>
         </w:rPr>
         <w:t>Charles Schwab</w:t>
+      </w:r>
+      <w:r>
+        <w:tab/>
+        <w:t>Oct 2014 - May 2016</w:t>
       </w:r>
     </w:p>
     <w:p>
@@ -323,7 +343,7 @@
         <w:pStyle w:val="Tech"/>
       </w:pPr>
       <w:r>
-        <w:t>Joined through Randstad as Senior iOS Developer; direct role.</w:t>
+        <w:t>Joined through Randstad as Senior iOS Developer, Oct 2014 - Feb 2015; direct role, Feb 2015 - May 2016.</w:t>
       </w:r>
     </w:p>
     <w:p>

</xml_diff>